<commit_message>
updated conception file and added diagrams
</commit_message>
<xml_diff>
--- a/Docs/conception TP3.docx
+++ b/Docs/conception TP3.docx
@@ -300,7 +300,15 @@
         <w:t xml:space="preserve"> jour ou obtenir un répertoire, l’idéal est donc de propager l’information inclues dans ce répertoire</w:t>
       </w:r>
       <w:r>
-        <w:t xml:space="preserve"> a travers tout le réseaux</w:t>
+        <w:t xml:space="preserve"> </w:t>
+      </w:r>
+      <w:proofErr w:type="spellStart"/>
+      <w:r>
+        <w:t>a</w:t>
+      </w:r>
+      <w:proofErr w:type="spellEnd"/>
+      <w:r>
+        <w:t xml:space="preserve"> travers tout le réseaux</w:t>
       </w:r>
       <w:r>
         <w:t>.</w:t>
@@ -314,7 +322,15 @@
         <w:t>à</w:t>
       </w:r>
       <w:r>
-        <w:t xml:space="preserve"> utiliser, nous allons donc utilisé un modèle basé sur une k-tree, dans lequel chaque nœud doit avoir au moins un enfant, ainsi il sera plus simple </w:t>
+        <w:t xml:space="preserve"> utiliser, nous allons donc utilisé un modèle basé sur une k-</w:t>
+      </w:r>
+      <w:proofErr w:type="spellStart"/>
+      <w:r>
+        <w:t>tree</w:t>
+      </w:r>
+      <w:proofErr w:type="spellEnd"/>
+      <w:r>
+        <w:t xml:space="preserve">, dans lequel chaque nœud doit avoir au moins un enfant, ainsi il sera plus simple </w:t>
       </w:r>
       <w:r>
         <w:t>à</w:t>
@@ -356,7 +372,13 @@
         <w:t xml:space="preserve"> datagramme </w:t>
       </w:r>
       <w:r>
-        <w:t xml:space="preserve">présenté ci-dessous, les clients prendrons différente action basé sur le type de datagramme reçue </w:t>
+        <w:t>présenté ci-dessous, les clients prendrons différente action basé sur le type de datagramme reçue</w:t>
+      </w:r>
+      <w:r>
+        <w:t>, le même datagramme sera utilisé en demande et en réponse</w:t>
+      </w:r>
+      <w:r>
+        <w:t xml:space="preserve"> </w:t>
       </w:r>
       <w:r>
         <w:t>:</w:t>
@@ -430,9 +452,11 @@
             <w:tcW w:w="846" w:type="dxa"/>
           </w:tcPr>
           <w:p>
+            <w:proofErr w:type="spellStart"/>
             <w:r>
               <w:t>ushort</w:t>
             </w:r>
+            <w:proofErr w:type="spellEnd"/>
           </w:p>
         </w:tc>
         <w:tc>
@@ -462,12 +486,14 @@
             <w:tcW w:w="846" w:type="dxa"/>
           </w:tcPr>
           <w:p>
+            <w:proofErr w:type="spellStart"/>
             <w:r>
               <w:t>u</w:t>
             </w:r>
             <w:r>
               <w:t>short</w:t>
             </w:r>
+            <w:proofErr w:type="spellEnd"/>
           </w:p>
         </w:tc>
         <w:tc>
@@ -529,9 +555,11 @@
             <w:tcW w:w="846" w:type="dxa"/>
           </w:tcPr>
           <w:p>
+            <w:proofErr w:type="spellStart"/>
             <w:r>
               <w:t>Ushort</w:t>
             </w:r>
+            <w:proofErr w:type="spellEnd"/>
           </w:p>
         </w:tc>
         <w:tc>
@@ -550,7 +578,13 @@
           </w:tcPr>
           <w:p>
             <w:r>
-              <w:t xml:space="preserve">Un nombre qui indique combien de ficher sont </w:t>
+              <w:t xml:space="preserve">Un nombre qui indique combien de </w:t>
+            </w:r>
+            <w:r>
+              <w:t>message</w:t>
+            </w:r>
+            <w:r>
+              <w:t xml:space="preserve"> sont </w:t>
             </w:r>
             <w:r>
               <w:t>à</w:t>
@@ -600,7 +634,25 @@
     <w:p/>
     <w:p>
       <w:r>
-        <w:t>De plus chaque message sera identifié avec un code, lequel décrit la tache a réaliser a la réception de ce message</w:t>
+        <w:t xml:space="preserve">De plus chaque message sera identifié avec un code, lequel décrit la </w:t>
+      </w:r>
+      <w:r>
+        <w:t>tâche</w:t>
+      </w:r>
+      <w:r>
+        <w:t xml:space="preserve"> </w:t>
+      </w:r>
+      <w:r>
+        <w:t>à</w:t>
+      </w:r>
+      <w:r>
+        <w:t xml:space="preserve"> réaliser </w:t>
+      </w:r>
+      <w:r>
+        <w:t>à</w:t>
+      </w:r>
+      <w:r>
+        <w:t xml:space="preserve"> la réception de ce message</w:t>
       </w:r>
       <w:r>
         <w:t xml:space="preserve"> par le récepteur</w:t>
@@ -683,7 +735,10 @@
           </w:tcPr>
           <w:p>
             <w:r>
-              <w:t>ASKPACKAGE</w:t>
+              <w:t>ASK</w:t>
+            </w:r>
+            <w:r>
+              <w:t>MESSAGE</w:t>
             </w:r>
           </w:p>
         </w:tc>
@@ -708,7 +763,10 @@
           </w:tcPr>
           <w:p>
             <w:r>
-              <w:t>SENDPACKAGE</w:t>
+              <w:t>SEND</w:t>
+            </w:r>
+            <w:r>
+              <w:t>MESSAGE</w:t>
             </w:r>
           </w:p>
         </w:tc>
@@ -1096,6 +1154,79 @@
         <w:rPr>
           <w:b/>
           <w:bCs/>
+          <w:sz w:val="24"/>
+          <w:szCs w:val="24"/>
+        </w:rPr>
+      </w:pPr>
+      <w:r>
+        <w:rPr>
+          <w:noProof/>
+        </w:rPr>
+        <w:drawing>
+          <wp:inline distT="0" distB="0" distL="0" distR="0" wp14:anchorId="3762E847" wp14:editId="6ACABF26">
+            <wp:extent cx="2990986" cy="3363402"/>
+            <wp:effectExtent l="0" t="0" r="0" b="8890"/>
+            <wp:docPr id="998278558" name="Picture 3" descr="A diagram of a code&#10;&#10;Description automatically generated"/>
+            <wp:cNvGraphicFramePr>
+              <a:graphicFrameLocks xmlns:a="http://schemas.openxmlformats.org/drawingml/2006/main" noChangeAspect="1"/>
+            </wp:cNvGraphicFramePr>
+            <a:graphic xmlns:a="http://schemas.openxmlformats.org/drawingml/2006/main">
+              <a:graphicData uri="http://schemas.openxmlformats.org/drawingml/2006/picture">
+                <pic:pic xmlns:pic="http://schemas.openxmlformats.org/drawingml/2006/picture">
+                  <pic:nvPicPr>
+                    <pic:cNvPr id="998278558" name="Picture 3" descr="A diagram of a code&#10;&#10;Description automatically generated"/>
+                    <pic:cNvPicPr>
+                      <a:picLocks noChangeAspect="1" noChangeArrowheads="1"/>
+                    </pic:cNvPicPr>
+                  </pic:nvPicPr>
+                  <pic:blipFill>
+                    <a:blip r:embed="rId5">
+                      <a:extLst>
+                        <a:ext uri="{28A0092B-C50C-407E-A947-70E740481C1C}">
+                          <a14:useLocalDpi xmlns:a14="http://schemas.microsoft.com/office/drawing/2010/main" val="0"/>
+                        </a:ext>
+                      </a:extLst>
+                    </a:blip>
+                    <a:srcRect/>
+                    <a:stretch>
+                      <a:fillRect/>
+                    </a:stretch>
+                  </pic:blipFill>
+                  <pic:spPr bwMode="auto">
+                    <a:xfrm>
+                      <a:off x="0" y="0"/>
+                      <a:ext cx="2996125" cy="3369181"/>
+                    </a:xfrm>
+                    <a:prstGeom prst="rect">
+                      <a:avLst/>
+                    </a:prstGeom>
+                    <a:noFill/>
+                    <a:ln>
+                      <a:noFill/>
+                    </a:ln>
+                  </pic:spPr>
+                </pic:pic>
+              </a:graphicData>
+            </a:graphic>
+          </wp:inline>
+        </w:drawing>
+      </w:r>
+    </w:p>
+    <w:p>
+      <w:pPr>
+        <w:rPr>
+          <w:b/>
+          <w:bCs/>
+          <w:sz w:val="24"/>
+          <w:szCs w:val="24"/>
+        </w:rPr>
+      </w:pPr>
+    </w:p>
+    <w:p>
+      <w:pPr>
+        <w:rPr>
+          <w:b/>
+          <w:bCs/>
         </w:rPr>
       </w:pPr>
       <w:r>
@@ -1113,6 +1244,14 @@
           <w:bCs/>
         </w:rPr>
       </w:pPr>
+    </w:p>
+    <w:p>
+      <w:pPr>
+        <w:rPr>
+          <w:b/>
+          <w:bCs/>
+        </w:rPr>
+      </w:pPr>
       <w:r>
         <w:rPr>
           <w:b/>
@@ -1134,6 +1273,14 @@
         </w:rPr>
         <w:t xml:space="preserve"> jour du répertoire :</w:t>
       </w:r>
+    </w:p>
+    <w:p>
+      <w:pPr>
+        <w:rPr>
+          <w:b/>
+          <w:bCs/>
+        </w:rPr>
+      </w:pPr>
     </w:p>
     <w:p>
       <w:pPr>
@@ -1196,6 +1343,9 @@
       <w:r>
         <w:t xml:space="preserve"> ici les principales classe qui seront utilisé pour le fonctionnement de l’application</w:t>
       </w:r>
+      <w:r>
+        <w:t>.</w:t>
+      </w:r>
     </w:p>
     <w:p/>
     <w:p>
@@ -1223,7 +1373,7 @@
           <w:sz w:val="24"/>
           <w:szCs w:val="24"/>
         </w:rPr>
-        <w:t>App</w:t>
+        <w:t>Session</w:t>
       </w:r>
     </w:p>
     <w:p>
@@ -1240,7 +1390,13 @@
         <w:t>classe</w:t>
       </w:r>
       <w:r>
-        <w:t xml:space="preserve"> contiendra l’information propre a l’application donc le socket et le mod</w:t>
+        <w:t xml:space="preserve"> contiendra l’information propre </w:t>
+      </w:r>
+      <w:r>
+        <w:t>à</w:t>
+      </w:r>
+      <w:r>
+        <w:t xml:space="preserve"> l’application donc le socket et le mod</w:t>
       </w:r>
       <w:r>
         <w:t>e</w:t>
@@ -1251,6 +1407,9 @@
       <w:r>
         <w:t xml:space="preserve"> (si est le premier nœud ou un enfant)</w:t>
       </w:r>
+      <w:r>
+        <w:t>, ainsi que le port sur laquelle se communique les clients</w:t>
+      </w:r>
     </w:p>
     <w:p/>
     <w:p>
@@ -1269,12 +1428,44 @@
           <w:sz w:val="24"/>
           <w:szCs w:val="24"/>
         </w:rPr>
-        <w:t>Classe : MessageReceiver </w:t>
-      </w:r>
-    </w:p>
-    <w:p>
-      <w:r>
-        <w:t xml:space="preserve">La tache principale de cette classe sera de recevoir les paquets UDP et les déballer selon le datagramme qui a été présenter. Aussi elle sera responsable </w:t>
+        <w:t xml:space="preserve">Classe : </w:t>
+      </w:r>
+      <w:proofErr w:type="spellStart"/>
+      <w:r>
+        <w:rPr>
+          <w:b/>
+          <w:bCs/>
+          <w:sz w:val="24"/>
+          <w:szCs w:val="24"/>
+        </w:rPr>
+        <w:t>MessageReceiver</w:t>
+      </w:r>
+      <w:proofErr w:type="spellEnd"/>
+      <w:r>
+        <w:rPr>
+          <w:b/>
+          <w:bCs/>
+          <w:sz w:val="24"/>
+          <w:szCs w:val="24"/>
+        </w:rPr>
+        <w:t> </w:t>
+      </w:r>
+    </w:p>
+    <w:p>
+      <w:r>
+        <w:t xml:space="preserve">La </w:t>
+      </w:r>
+      <w:r>
+        <w:t>tâche</w:t>
+      </w:r>
+      <w:r>
+        <w:t xml:space="preserve"> principale de cette classe sera de recevoir les paquets UDP et les déballer selon le datagramme qui a été présent</w:t>
+      </w:r>
+      <w:r>
+        <w:t>é</w:t>
+      </w:r>
+      <w:r>
+        <w:t xml:space="preserve">. Aussi elle sera responsable </w:t>
       </w:r>
       <w:r>
         <w:t>d’initialiser</w:t>
@@ -1282,6 +1473,9 @@
       <w:r>
         <w:t xml:space="preserve"> les ressource et la tache liée au commencement de la réception d’un nouveaux fichier</w:t>
       </w:r>
+      <w:r>
+        <w:t>.</w:t>
+      </w:r>
     </w:p>
     <w:p/>
     <w:p>
@@ -1300,12 +1494,29 @@
           <w:sz w:val="24"/>
           <w:szCs w:val="24"/>
         </w:rPr>
-        <w:t>Classe : MessageSender</w:t>
-      </w:r>
-    </w:p>
-    <w:p>
-      <w:r>
-        <w:t>La principale tache d</w:t>
+        <w:t xml:space="preserve">Classe : </w:t>
+      </w:r>
+      <w:proofErr w:type="spellStart"/>
+      <w:r>
+        <w:rPr>
+          <w:b/>
+          <w:bCs/>
+          <w:sz w:val="24"/>
+          <w:szCs w:val="24"/>
+        </w:rPr>
+        <w:t>MessageSender</w:t>
+      </w:r>
+      <w:proofErr w:type="spellEnd"/>
+    </w:p>
+    <w:p>
+      <w:r>
+        <w:t xml:space="preserve">La principale </w:t>
+      </w:r>
+      <w:r>
+        <w:t>tâche</w:t>
+      </w:r>
+      <w:r>
+        <w:t xml:space="preserve"> d</w:t>
       </w:r>
       <w:r>
         <w:t>e</w:t>
@@ -1313,6 +1524,9 @@
       <w:r>
         <w:t xml:space="preserve"> cette classe sera de prendre le datagramme et l’envoyer en paquet UDP</w:t>
       </w:r>
+      <w:r>
+        <w:t xml:space="preserve"> au destinataire</w:t>
+      </w:r>
     </w:p>
     <w:p/>
     <w:p>
@@ -1331,7 +1545,6 @@
           <w:sz w:val="24"/>
           <w:szCs w:val="24"/>
         </w:rPr>
-        <w:lastRenderedPageBreak/>
         <w:t xml:space="preserve">Classe : </w:t>
       </w:r>
       <w:r>
@@ -1343,6 +1556,81 @@
         </w:rPr>
         <w:t>Nœud</w:t>
       </w:r>
+    </w:p>
+    <w:p>
+      <w:r>
+        <w:t>Cette classe sera charge de prendre les action associé au message reçue, par exemple propager le répertoire aux nœud voisin quand une modification est apporté au répertoire</w:t>
+      </w:r>
+    </w:p>
+    <w:p>
+      <w:pPr>
+        <w:rPr>
+          <w:b/>
+          <w:bCs/>
+          <w:sz w:val="24"/>
+          <w:szCs w:val="24"/>
+        </w:rPr>
+      </w:pPr>
+    </w:p>
+    <w:p>
+      <w:pPr>
+        <w:rPr>
+          <w:b/>
+          <w:bCs/>
+          <w:sz w:val="24"/>
+          <w:szCs w:val="24"/>
+        </w:rPr>
+      </w:pPr>
+    </w:p>
+    <w:p>
+      <w:pPr>
+        <w:rPr>
+          <w:b/>
+          <w:bCs/>
+          <w:sz w:val="24"/>
+          <w:szCs w:val="24"/>
+        </w:rPr>
+      </w:pPr>
+    </w:p>
+    <w:p>
+      <w:pPr>
+        <w:rPr>
+          <w:b/>
+          <w:bCs/>
+          <w:sz w:val="24"/>
+          <w:szCs w:val="24"/>
+        </w:rPr>
+      </w:pPr>
+    </w:p>
+    <w:p>
+      <w:pPr>
+        <w:rPr>
+          <w:b/>
+          <w:bCs/>
+          <w:sz w:val="24"/>
+          <w:szCs w:val="24"/>
+        </w:rPr>
+      </w:pPr>
+    </w:p>
+    <w:p>
+      <w:pPr>
+        <w:rPr>
+          <w:b/>
+          <w:bCs/>
+          <w:sz w:val="24"/>
+          <w:szCs w:val="24"/>
+        </w:rPr>
+      </w:pPr>
+    </w:p>
+    <w:p>
+      <w:pPr>
+        <w:rPr>
+          <w:b/>
+          <w:bCs/>
+          <w:sz w:val="24"/>
+          <w:szCs w:val="24"/>
+        </w:rPr>
+      </w:pPr>
     </w:p>
     <w:p>
       <w:pPr>
@@ -1370,38 +1658,74 @@
           <w:sz w:val="28"/>
           <w:szCs w:val="28"/>
         </w:rPr>
-        <w:t>Diagrammes</w:t>
-      </w:r>
-    </w:p>
-    <w:p>
-      <w:pPr>
-        <w:rPr>
-          <w:b/>
-          <w:bCs/>
-          <w:sz w:val="24"/>
-          <w:szCs w:val="24"/>
-        </w:rPr>
-      </w:pPr>
-      <w:r>
-        <w:rPr>
-          <w:b/>
-          <w:bCs/>
-          <w:sz w:val="24"/>
-          <w:szCs w:val="24"/>
-        </w:rPr>
+        <w:lastRenderedPageBreak/>
         <w:t>Diagramme</w:t>
       </w:r>
       <w:r>
         <w:rPr>
           <w:b/>
           <w:bCs/>
-          <w:sz w:val="24"/>
-          <w:szCs w:val="24"/>
+          <w:sz w:val="28"/>
+          <w:szCs w:val="28"/>
         </w:rPr>
         <w:t xml:space="preserve"> de classe</w:t>
       </w:r>
     </w:p>
-    <w:p/>
+    <w:p>
+      <w:r>
+        <w:rPr>
+          <w:noProof/>
+        </w:rPr>
+        <w:drawing>
+          <wp:inline distT="0" distB="0" distL="0" distR="0" wp14:anchorId="015AFC48" wp14:editId="5F965F60">
+            <wp:extent cx="5486400" cy="2992120"/>
+            <wp:effectExtent l="0" t="0" r="0" b="0"/>
+            <wp:docPr id="1793553483" name="Picture 2" descr="A diagram of a software company&#10;&#10;Description automatically generated with medium confidence"/>
+            <wp:cNvGraphicFramePr>
+              <a:graphicFrameLocks xmlns:a="http://schemas.openxmlformats.org/drawingml/2006/main" noChangeAspect="1"/>
+            </wp:cNvGraphicFramePr>
+            <a:graphic xmlns:a="http://schemas.openxmlformats.org/drawingml/2006/main">
+              <a:graphicData uri="http://schemas.openxmlformats.org/drawingml/2006/picture">
+                <pic:pic xmlns:pic="http://schemas.openxmlformats.org/drawingml/2006/picture">
+                  <pic:nvPicPr>
+                    <pic:cNvPr id="1793553483" name="Picture 2" descr="A diagram of a software company&#10;&#10;Description automatically generated with medium confidence"/>
+                    <pic:cNvPicPr>
+                      <a:picLocks noChangeAspect="1" noChangeArrowheads="1"/>
+                    </pic:cNvPicPr>
+                  </pic:nvPicPr>
+                  <pic:blipFill>
+                    <a:blip r:embed="rId6" cstate="print">
+                      <a:extLst>
+                        <a:ext uri="{28A0092B-C50C-407E-A947-70E740481C1C}">
+                          <a14:useLocalDpi xmlns:a14="http://schemas.microsoft.com/office/drawing/2010/main" val="0"/>
+                        </a:ext>
+                      </a:extLst>
+                    </a:blip>
+                    <a:srcRect/>
+                    <a:stretch>
+                      <a:fillRect/>
+                    </a:stretch>
+                  </pic:blipFill>
+                  <pic:spPr bwMode="auto">
+                    <a:xfrm>
+                      <a:off x="0" y="0"/>
+                      <a:ext cx="5486400" cy="2992120"/>
+                    </a:xfrm>
+                    <a:prstGeom prst="rect">
+                      <a:avLst/>
+                    </a:prstGeom>
+                    <a:noFill/>
+                    <a:ln>
+                      <a:noFill/>
+                    </a:ln>
+                  </pic:spPr>
+                </pic:pic>
+              </a:graphicData>
+            </a:graphic>
+          </wp:inline>
+        </w:drawing>
+      </w:r>
+    </w:p>
     <w:p/>
     <w:p/>
     <w:p/>

</xml_diff>